<commit_message>
update Oakland ex parte instructions; fix identical question IDs
</commit_message>
<xml_diff>
--- a/docassemble/MLHPPOAndProposedOrder/data/templates/oakland_county_instructions_ex_parte.docx
+++ b/docassemble/MLHPPOAndProposedOrder/data/templates/oakland_county_instructions_ex_parte.docx
@@ -172,6 +172,54 @@
     </w:p>
     <w:p>
       <w:pPr>
+        <w:pStyle w:val="BulletedList"/>
+        <w:numPr>
+          <w:ilvl w:val="0"/>
+          <w:numId w:val="0"/>
+        </w:numPr>
+        <w:ind w:left="720" w:hanging="360"/>
+      </w:pPr>
+    </w:p>
+    <w:p>
+      <w:pPr>
+        <w:pStyle w:val="BulletedList"/>
+        <w:numPr>
+          <w:ilvl w:val="0"/>
+          <w:numId w:val="0"/>
+        </w:numPr>
+        <w:ind w:left="720" w:hanging="360"/>
+        <w:rPr>
+          <w:color w:val="auto"/>
+        </w:rPr>
+      </w:pPr>
+      <w:r>
+        <w:rPr>
+          <w:color w:val="auto"/>
+        </w:rPr>
+        <w:t xml:space="preserve">Note: Everything submitted for the PPO (including evidence) will become part of a court file that is </w:t>
+      </w:r>
+    </w:p>
+    <w:p>
+      <w:pPr>
+        <w:pStyle w:val="BulletedList"/>
+        <w:numPr>
+          <w:ilvl w:val="0"/>
+          <w:numId w:val="0"/>
+        </w:numPr>
+        <w:ind w:left="360"/>
+        <w:rPr>
+          <w:color w:val="auto"/>
+        </w:rPr>
+      </w:pPr>
+      <w:r>
+        <w:rPr>
+          <w:color w:val="auto"/>
+        </w:rPr>
+        <w:t xml:space="preserve">visible to the public. If a PPO is signed or if the judge grants a hearing, the Respondent will need to be served and provided copies of everything filed. Therefore, if you asked for your address and telephone number to be kept confidential, you will need to remove/redact this information from all evidence before submitting it. </w:t>
+      </w:r>
+    </w:p>
+    <w:p>
+      <w:pPr>
         <w:pStyle w:val="Normalforinsertedinstructions"/>
       </w:pPr>
       <w:r>
@@ -434,6 +482,7 @@
         <w:pStyle w:val="BulletedList"/>
       </w:pPr>
       <w:r>
+        <w:lastRenderedPageBreak/>
         <w:t>Contact Information Sheet</w:t>
       </w:r>
     </w:p>
@@ -490,7 +539,6 @@
         <w:rPr>
           <w:color w:val="000000"/>
         </w:rPr>
-        <w:lastRenderedPageBreak/>
         <w:t>Your petition will be signed electronically when you download it.</w:t>
       </w:r>
       <w:r>
@@ -631,154 +679,178 @@
         <w:pStyle w:val="Normalforinsertedinstructions"/>
       </w:pPr>
       <w:r>
-        <w:t>After the PPO Office receives your forms, they will file the forms with the Court Clerk’s Office. If anything is incorrect or missing from your filing, the PPO Office will e-mail you to ask for corrections.</w:t>
+        <w:t xml:space="preserve">After the PPO Office receives your forms, if anything is incorrect or missing from your filing, the PPO Office will e-mail you to ask for corrections. It is important that you make any requested corrections and resubmit promptly to avoid filing delays. Once all forms are received, the PPO Office will file the forms with the Court Clerk’s </w:t>
+      </w:r>
+      <w:proofErr w:type="gramStart"/>
+      <w:r>
+        <w:t>Office</w:t>
+      </w:r>
+      <w:proofErr w:type="gramEnd"/>
+      <w:r>
+        <w:t xml:space="preserve"> and you will be sent a confirmation email. It is important that you keep this email because it has an attachment called “Procedural Instructions for PPO,” which will provide useful information that you need to know once you receive an order.  </w:t>
+      </w:r>
+    </w:p>
+    <w:p>
+      <w:pPr>
+        <w:pStyle w:val="Normalforinsertedinstructions"/>
+      </w:pPr>
+      <w:r>
+        <w:t xml:space="preserve">If you have any questions about your petition, call the PPO Office at 248-303-1534. </w:t>
+      </w:r>
+    </w:p>
+    <w:p>
+      <w:pPr>
+        <w:pStyle w:val="Normalforinsertedinstructions"/>
+      </w:pPr>
+      <w:r>
+        <w:t xml:space="preserve">{%p if </w:t>
+      </w:r>
+      <w:proofErr w:type="spellStart"/>
+      <w:r>
+        <w:t>has_next_friend_</w:t>
+      </w:r>
+      <w:proofErr w:type="gramStart"/>
+      <w:r>
+        <w:t>petitioning</w:t>
+      </w:r>
+      <w:proofErr w:type="spellEnd"/>
+      <w:r>
+        <w:t xml:space="preserve"> %}</w:t>
+      </w:r>
+      <w:proofErr w:type="gramEnd"/>
+    </w:p>
+    <w:p>
+      <w:pPr>
+        <w:pStyle w:val="Normalforinsertedinstructions"/>
+      </w:pPr>
+      <w:r>
+        <w:t>Your next friend will need to file your forms for you.</w:t>
+      </w:r>
+    </w:p>
+    <w:p>
+      <w:pPr>
+        <w:pStyle w:val="Normalforinsertedinstructions"/>
+      </w:pPr>
+      <w:r>
+        <w:t xml:space="preserve">{%p </w:t>
+      </w:r>
+      <w:proofErr w:type="gramStart"/>
+      <w:r>
+        <w:t>endif %}</w:t>
+      </w:r>
+      <w:proofErr w:type="gramEnd"/>
+    </w:p>
+    <w:p>
+      <w:pPr>
+        <w:pStyle w:val="Heading3"/>
+      </w:pPr>
+      <w:r>
+        <w:lastRenderedPageBreak/>
+        <w:t>Step 4: The judge will review your petition</w:t>
+      </w:r>
+    </w:p>
+    <w:p>
+      <w:pPr>
+        <w:pStyle w:val="Normalforinsertedinstructions"/>
+      </w:pPr>
+      <w:r>
+        <w:t xml:space="preserve">It can take approximately 24 to 72 business hours for a judge to review a PPO petition. It may take a little longer than this for the documents to be processed </w:t>
+      </w:r>
+      <w:r>
+        <w:t>and an order to be issued depending on the facts of your case and the judge’s docket.</w:t>
+      </w:r>
+    </w:p>
+    <w:p>
+      <w:pPr>
+        <w:pStyle w:val="Heading3"/>
+      </w:pPr>
+      <w:r>
+        <w:t xml:space="preserve">Step 5: After the judge </w:t>
+      </w:r>
+      <w:proofErr w:type="gramStart"/>
+      <w:r>
+        <w:t>makes a decision</w:t>
+      </w:r>
+      <w:proofErr w:type="gramEnd"/>
+    </w:p>
+    <w:p>
+      <w:pPr>
+        <w:pStyle w:val="Normalforinsertedinstructions"/>
+      </w:pPr>
+      <w:r>
+        <w:t xml:space="preserve">After a judge reviews your petition and </w:t>
+      </w:r>
+      <w:proofErr w:type="gramStart"/>
+      <w:r>
+        <w:t>makes a decision</w:t>
+      </w:r>
+      <w:proofErr w:type="gramEnd"/>
+      <w:r>
+        <w:t xml:space="preserve">, the judge’s clerk will email you a copy of the order. </w:t>
+      </w:r>
+      <w:r>
+        <w:t xml:space="preserve"> This could be any one of the following:</w:t>
+      </w:r>
+    </w:p>
+    <w:p>
+      <w:pPr>
+        <w:pStyle w:val="BulletedList"/>
+      </w:pPr>
+      <w:r>
+        <w:t>Personal Protection Order</w:t>
+      </w:r>
+    </w:p>
+    <w:p>
+      <w:pPr>
+        <w:pStyle w:val="BulletedList"/>
+      </w:pPr>
+      <w:r>
+        <w:t>Order denying a PPO</w:t>
+      </w:r>
+    </w:p>
+    <w:p>
+      <w:pPr>
+        <w:pStyle w:val="BulletedList"/>
+      </w:pPr>
+      <w:r>
+        <w:t xml:space="preserve">Order denying the ex </w:t>
+      </w:r>
+      <w:proofErr w:type="spellStart"/>
+      <w:r>
+        <w:t>parte</w:t>
+      </w:r>
+      <w:proofErr w:type="spellEnd"/>
+      <w:r>
+        <w:t xml:space="preserve"> PPO along with a Notice of Hearing that shows the date, time, and location of your scheduled hearing </w:t>
+      </w:r>
+    </w:p>
+    <w:p>
+      <w:pPr>
+        <w:pStyle w:val="Normalforinsertedinstructions"/>
+      </w:pPr>
+      <w:r>
+        <w:t xml:space="preserve">If you get an order of denial with a Notice of Hearing, this means the judge wants to hear more on the matter, so they scheduled your petition for a hearing. </w:t>
+      </w:r>
+      <w:r>
+        <w:t>You will find important information on next steps in the</w:t>
       </w:r>
       <w:r>
         <w:t xml:space="preserve"> </w:t>
       </w:r>
-    </w:p>
-    <w:p>
-      <w:pPr>
-        <w:pStyle w:val="Normalforinsertedinstructions"/>
-      </w:pPr>
-      <w:r>
-        <w:t xml:space="preserve">If you have any questions about your petition, call the PPO Office at 248-303-1534. </w:t>
-      </w:r>
-    </w:p>
-    <w:p>
-      <w:pPr>
-        <w:pStyle w:val="Normalforinsertedinstructions"/>
-      </w:pPr>
-      <w:r>
-        <w:t xml:space="preserve">{%p if </w:t>
-      </w:r>
-      <w:proofErr w:type="spellStart"/>
-      <w:r>
-        <w:t>has_next_friend_</w:t>
-      </w:r>
-      <w:proofErr w:type="gramStart"/>
-      <w:r>
-        <w:t>petitioning</w:t>
-      </w:r>
-      <w:proofErr w:type="spellEnd"/>
-      <w:r>
-        <w:t xml:space="preserve"> %}</w:t>
-      </w:r>
-      <w:proofErr w:type="gramEnd"/>
-    </w:p>
-    <w:p>
-      <w:pPr>
-        <w:pStyle w:val="Normalforinsertedinstructions"/>
-      </w:pPr>
-      <w:r>
-        <w:t>Your next friend will need to file your forms for you.</w:t>
-      </w:r>
-    </w:p>
-    <w:p>
-      <w:pPr>
-        <w:pStyle w:val="Normalforinsertedinstructions"/>
-      </w:pPr>
-      <w:r>
-        <w:t xml:space="preserve">{%p </w:t>
-      </w:r>
-      <w:proofErr w:type="gramStart"/>
-      <w:r>
-        <w:t>endif %}</w:t>
-      </w:r>
-      <w:proofErr w:type="gramEnd"/>
-    </w:p>
-    <w:p>
-      <w:pPr>
-        <w:pStyle w:val="Heading3"/>
-      </w:pPr>
-      <w:r>
-        <w:t>Step 4: The judge will review your petition</w:t>
-      </w:r>
-    </w:p>
-    <w:p>
-      <w:pPr>
-        <w:pStyle w:val="Normalforinsertedinstructions"/>
-      </w:pPr>
-      <w:r>
-        <w:t xml:space="preserve">It can take approximately 24 to 72 business hours for a judge to review a PPO petition. It may take a little longer than this for the documents to be processed and the PPO Office to e-mail you with the judge’s decision. The PPO Office will e-mail you to tell you when your PPO Petition is filed, and they will e-mail you again once the judge </w:t>
-      </w:r>
-      <w:proofErr w:type="gramStart"/>
-      <w:r>
-        <w:t>makes a decision</w:t>
-      </w:r>
-      <w:proofErr w:type="gramEnd"/>
-      <w:r>
-        <w:t xml:space="preserve"> and signs an order.</w:t>
-      </w:r>
-    </w:p>
-    <w:p>
-      <w:pPr>
-        <w:pStyle w:val="Heading3"/>
-      </w:pPr>
-      <w:r>
-        <w:t xml:space="preserve">Step 5: After the judge </w:t>
-      </w:r>
-      <w:proofErr w:type="gramStart"/>
-      <w:r>
-        <w:t>makes a decision</w:t>
-      </w:r>
-      <w:proofErr w:type="gramEnd"/>
-    </w:p>
-    <w:p>
-      <w:pPr>
-        <w:pStyle w:val="Normalforinsertedinstructions"/>
-      </w:pPr>
-      <w:r>
-        <w:t xml:space="preserve">After a judge reviews your petition and </w:t>
-      </w:r>
-      <w:proofErr w:type="gramStart"/>
-      <w:r>
-        <w:t>makes a decision</w:t>
-      </w:r>
-      <w:proofErr w:type="gramEnd"/>
-      <w:r>
-        <w:t>, the PPO Office will e-mail you a copy of the order the judge signed. This could be any one of the following:</w:t>
-      </w:r>
-    </w:p>
-    <w:p>
-      <w:pPr>
-        <w:pStyle w:val="BulletedList"/>
-      </w:pPr>
-      <w:r>
-        <w:t>Personal Protection Order (along with documents needed for service and instructions)</w:t>
-      </w:r>
-    </w:p>
-    <w:p>
-      <w:pPr>
-        <w:pStyle w:val="BulletedList"/>
-      </w:pPr>
-      <w:r>
-        <w:lastRenderedPageBreak/>
-        <w:t>Order denying a PPO</w:t>
-      </w:r>
-    </w:p>
-    <w:p>
-      <w:pPr>
-        <w:pStyle w:val="BulletedList"/>
-      </w:pPr>
-      <w:r>
-        <w:t xml:space="preserve">Order denying the ex </w:t>
-      </w:r>
-      <w:proofErr w:type="spellStart"/>
-      <w:r>
-        <w:t>parte</w:t>
-      </w:r>
-      <w:proofErr w:type="spellEnd"/>
-      <w:r>
-        <w:t xml:space="preserve"> PPO along with a Notice of Hearing that shows the date, time, and location of your scheduled hearing (along with documents needed for service and instructions)</w:t>
-      </w:r>
-    </w:p>
-    <w:p>
-      <w:pPr>
-        <w:pStyle w:val="Normalforinsertedinstructions"/>
-      </w:pPr>
-      <w:r>
-        <w:t>If you get an order of denial with a Notice of Hearing, this means the judge wants to hear more on the matter, so they scheduled your petition for a hearing. Follow the instructions the court sends you to have the Respondent served with all necessary papers before the hearing.</w:t>
+      <w:r>
+        <w:t xml:space="preserve">confirmation email from the PPO Office. This email includes a </w:t>
+      </w:r>
+      <w:r>
+        <w:t>“</w:t>
+      </w:r>
+      <w:r>
+        <w:t>Procedural Instructions for PPO</w:t>
+      </w:r>
+      <w:r>
+        <w:t>”</w:t>
+      </w:r>
+      <w:r>
+        <w:t xml:space="preserve"> document. Review the pages on “What Can Happen After I Request a PPO” and “Service" to learn what forms must be served, how to have the Respondent served, and how to file your Proof of Service before the hearing.</w:t>
       </w:r>
     </w:p>
     <w:p>
@@ -794,7 +866,16 @@
         <w:pStyle w:val="Normalforinsertedinstructions"/>
       </w:pPr>
       <w:r>
-        <w:t xml:space="preserve">If you get a denial order and the court did not schedule your petition for a hearing, you can ask to schedule a hearing. You must do this within 21 days of the judge’s denial if you want a hearing. Follow the </w:t>
+        <w:t xml:space="preserve">If you get a denial order and the court did not schedule your petition for a hearing, you can ask to schedule a hearing. You must do this within 21 days of </w:t>
+      </w:r>
+      <w:r>
+        <w:t>the date the judge signed the denial order</w:t>
+      </w:r>
+      <w:r>
+        <w:t xml:space="preserve"> </w:t>
+      </w:r>
+      <w:r>
+        <w:t xml:space="preserve">if you want a hearing. Follow the </w:t>
       </w:r>
       <w:r>
         <w:t xml:space="preserve">{% if </w:t>
@@ -884,524 +965,39 @@
         <w:t>{% endif %}</w:t>
       </w:r>
       <w:r>
-        <w:t xml:space="preserve"> instructions. If the PPO Office e-mails you a denial order, they will also send you a form to complete if you want to request a hearing. This form must be completed and submitted through </w:t>
-      </w:r>
-      <w:proofErr w:type="spellStart"/>
-      <w:r>
-        <w:t>MiFILE</w:t>
-      </w:r>
-      <w:proofErr w:type="spellEnd"/>
-      <w:r>
-        <w:t>. Instructions for this will be sent in the same e-mail.</w:t>
-      </w:r>
-    </w:p>
-    <w:p>
-      <w:pPr>
-        <w:pStyle w:val="Heading3"/>
-      </w:pPr>
-      <w:r>
-        <w:t xml:space="preserve">Step 6: Have the Respondent served </w:t>
-      </w:r>
-    </w:p>
-    <w:p>
-      <w:pPr>
-        <w:pStyle w:val="Normalforinsertedinstructions"/>
-        <w:rPr>
-          <w:color w:val="000000"/>
-        </w:rPr>
-      </w:pPr>
-      <w:r>
-        <w:rPr>
-          <w:b/>
-          <w:color w:val="000000"/>
-        </w:rPr>
-        <w:t>Gather what you need for service.</w:t>
-      </w:r>
-      <w:r>
-        <w:rPr>
-          <w:color w:val="000000"/>
-        </w:rPr>
-        <w:t xml:space="preserve"> If a judge granted you a PPO, you </w:t>
-      </w:r>
-      <w:proofErr w:type="gramStart"/>
-      <w:r>
-        <w:rPr>
-          <w:color w:val="000000"/>
-        </w:rPr>
-        <w:t>will</w:t>
-      </w:r>
-      <w:proofErr w:type="gramEnd"/>
-      <w:r>
-        <w:rPr>
-          <w:color w:val="000000"/>
-        </w:rPr>
-        <w:t xml:space="preserve"> need the Personal Protection Order</w:t>
-      </w:r>
-      <w:r>
-        <w:t xml:space="preserve"> and the </w:t>
-      </w:r>
-      <w:r>
-        <w:rPr>
-          <w:color w:val="000000"/>
-        </w:rPr>
-        <w:t>Petition (with any evidence you filed). You also need the Respondent's address and any other information the process server needs to find the Respondent.</w:t>
-      </w:r>
-    </w:p>
-    <w:p>
-      <w:pPr>
-        <w:pStyle w:val="Normalforinsertedinstructions"/>
-        <w:rPr>
-          <w:color w:val="000000"/>
-        </w:rPr>
-      </w:pPr>
-      <w:r>
-        <w:rPr>
-          <w:color w:val="000000"/>
-        </w:rPr>
-        <w:t xml:space="preserve">If the judge denied your ex </w:t>
-      </w:r>
-      <w:proofErr w:type="spellStart"/>
-      <w:r>
-        <w:rPr>
-          <w:color w:val="000000"/>
-        </w:rPr>
-        <w:t>parte</w:t>
-      </w:r>
-      <w:proofErr w:type="spellEnd"/>
-      <w:r>
-        <w:rPr>
-          <w:color w:val="000000"/>
-        </w:rPr>
-        <w:t xml:space="preserve"> PPO petition but set a hearing, you will need the PPO Petition (with any evidence you filed), Notice of Hearing, and Zoom instructions (if the PPO Office sent you Zoom instructions). You also need the Respondent's address and any other information the process server needs to find the Respondent.</w:t>
-      </w:r>
-    </w:p>
-    <w:p>
-      <w:pPr>
-        <w:pStyle w:val="Normalforinsertedinstructions"/>
-        <w:rPr>
-          <w:b/>
-          <w:color w:val="000000"/>
-        </w:rPr>
-      </w:pPr>
-      <w:r>
-        <w:rPr>
-          <w:b/>
-          <w:color w:val="000000"/>
-        </w:rPr>
-        <w:t>Have the papers served (sent or given to) the Respondent.</w:t>
-      </w:r>
-      <w:r>
-        <w:rPr>
-          <w:color w:val="000000"/>
-        </w:rPr>
-        <w:t xml:space="preserve"> This can be done by a police officer, professional process server, or someone else who is 18 years or older. The PPO Office will e-mail you the contact information of the Sheriff’s Office Civil Unit as an option of someone who can serve the documents for you. </w:t>
-      </w:r>
-      <w:r>
-        <w:t xml:space="preserve">{% if </w:t>
-      </w:r>
-      <w:proofErr w:type="spellStart"/>
-      <w:r>
-        <w:t>has_next_friend_petitioning</w:t>
-      </w:r>
-      <w:proofErr w:type="spellEnd"/>
-      <w:r>
-        <w:t xml:space="preserve"> </w:t>
-      </w:r>
-      <w:proofErr w:type="gramStart"/>
-      <w:r>
-        <w:t>%}</w:t>
-      </w:r>
-      <w:r>
-        <w:rPr>
-          <w:b/>
-          <w:bCs/>
-          <w:color w:val="000000"/>
-        </w:rPr>
-        <w:t>Neither</w:t>
-      </w:r>
-      <w:proofErr w:type="gramEnd"/>
-      <w:r>
-        <w:rPr>
-          <w:b/>
-          <w:bCs/>
-          <w:color w:val="000000"/>
-        </w:rPr>
-        <w:t xml:space="preserve"> you nor your next friend is allowed to serve the </w:t>
-      </w:r>
-      <w:proofErr w:type="gramStart"/>
-      <w:r>
-        <w:rPr>
-          <w:b/>
-          <w:bCs/>
-          <w:color w:val="000000"/>
-        </w:rPr>
-        <w:t>Respondent.</w:t>
-      </w:r>
-      <w:r>
-        <w:t>{</w:t>
-      </w:r>
-      <w:proofErr w:type="gramEnd"/>
-      <w:r>
-        <w:t>%</w:t>
-      </w:r>
-      <w:r>
-        <w:t xml:space="preserve"> else</w:t>
-      </w:r>
-      <w:r>
-        <w:t xml:space="preserve"> </w:t>
-      </w:r>
-      <w:proofErr w:type="gramStart"/>
-      <w:r>
-        <w:t>%}</w:t>
-      </w:r>
-      <w:r>
-        <w:rPr>
-          <w:b/>
-          <w:color w:val="000000"/>
-        </w:rPr>
-        <w:t>Do</w:t>
-      </w:r>
-      <w:proofErr w:type="gramEnd"/>
-      <w:r>
-        <w:rPr>
-          <w:b/>
-          <w:color w:val="000000"/>
-        </w:rPr>
-        <w:t xml:space="preserve"> not serve the Respondent </w:t>
-      </w:r>
-      <w:proofErr w:type="gramStart"/>
-      <w:r>
-        <w:rPr>
-          <w:b/>
-          <w:color w:val="000000"/>
-        </w:rPr>
-        <w:t>yourself.</w:t>
-      </w:r>
-      <w:r>
-        <w:t>{</w:t>
-      </w:r>
-      <w:proofErr w:type="gramEnd"/>
-      <w:r>
-        <w:t xml:space="preserve">% </w:t>
-      </w:r>
-      <w:proofErr w:type="gramStart"/>
-      <w:r>
-        <w:t>endif %}</w:t>
-      </w:r>
-      <w:proofErr w:type="gramEnd"/>
-    </w:p>
-    <w:p>
-      <w:pPr>
-        <w:pStyle w:val="Normalforinsertedinstructions"/>
-        <w:rPr>
-          <w:color w:val="000000"/>
-        </w:rPr>
-      </w:pPr>
-      <w:r>
-        <w:rPr>
-          <w:color w:val="000000"/>
-        </w:rPr>
-        <w:t xml:space="preserve">The papers can also be served by registered mail with </w:t>
-      </w:r>
-      <w:proofErr w:type="gramStart"/>
-      <w:r>
-        <w:rPr>
-          <w:color w:val="000000"/>
-        </w:rPr>
-        <w:t>return</w:t>
-      </w:r>
-      <w:proofErr w:type="gramEnd"/>
-      <w:r>
-        <w:rPr>
-          <w:color w:val="000000"/>
-        </w:rPr>
-        <w:t xml:space="preserve"> receipt requested and delivery restricted to the Respondent. Even if the Respondent is served by mail, you need to find someone else to do the mailing. </w:t>
-      </w:r>
-      <w:r>
-        <w:rPr>
-          <w:color w:val="202124"/>
-        </w:rPr>
-        <w:t>The server’s address—not yours—should be the one on the return receipt.</w:t>
-      </w:r>
-      <w:r>
-        <w:rPr>
-          <w:color w:val="000000"/>
-        </w:rPr>
-        <w:t xml:space="preserve"> To learn more, read </w:t>
-      </w:r>
-      <w:hyperlink r:id="rId12">
+        <w:t xml:space="preserve"> instructions. </w:t>
+      </w:r>
+      <w:r>
+        <w:t xml:space="preserve">If you want to ask for a hearing, please send an email to the PPO Office at </w:t>
+      </w:r>
+      <w:hyperlink r:id="rId12" w:history="1">
         <w:r>
           <w:rPr>
             <w:color w:val="0563C1"/>
             <w:u w:val="single"/>
           </w:rPr>
-          <w:t>Serving Your Personal Protection Order</w:t>
+          <w:t>ppo@oaklan</w:t>
+        </w:r>
+        <w:r>
+          <w:rPr>
+            <w:color w:val="0563C1"/>
+            <w:u w:val="single"/>
+          </w:rPr>
+          <w:t>d</w:t>
+        </w:r>
+        <w:r>
+          <w:rPr>
+            <w:color w:val="0563C1"/>
+            <w:u w:val="single"/>
+          </w:rPr>
+          <w:t>countymi.gov</w:t>
         </w:r>
       </w:hyperlink>
       <w:r>
-        <w:rPr>
-          <w:color w:val="000000"/>
-        </w:rPr>
-        <w:t xml:space="preserve">. </w:t>
-      </w:r>
-    </w:p>
-    <w:p>
-      <w:pPr>
-        <w:pStyle w:val="Normalforinsertedinstructions"/>
-        <w:rPr>
-          <w:color w:val="000000"/>
-        </w:rPr>
-      </w:pPr>
-      <w:proofErr w:type="gramStart"/>
-      <w:r>
-        <w:t>{%p if</w:t>
-      </w:r>
-      <w:proofErr w:type="gramEnd"/>
-      <w:r>
-        <w:t xml:space="preserve"> </w:t>
-      </w:r>
-      <w:proofErr w:type="spellStart"/>
-      <w:r>
-        <w:t>respondent_is_minor</w:t>
-      </w:r>
-      <w:proofErr w:type="spellEnd"/>
-      <w:r>
-        <w:t xml:space="preserve"> and not </w:t>
-      </w:r>
-      <w:proofErr w:type="spellStart"/>
-      <w:r>
-        <w:t>respondent_is_emancipated_</w:t>
-      </w:r>
-      <w:proofErr w:type="gramStart"/>
-      <w:r>
-        <w:t>minor</w:t>
-      </w:r>
-      <w:proofErr w:type="spellEnd"/>
-      <w:r>
-        <w:t xml:space="preserve"> %}</w:t>
-      </w:r>
-      <w:proofErr w:type="gramEnd"/>
-    </w:p>
-    <w:p>
-      <w:pPr>
-        <w:pStyle w:val="Normalforinsertedinstructions"/>
-        <w:rPr>
-          <w:color w:val="000000"/>
-        </w:rPr>
-      </w:pPr>
-      <w:r>
-        <w:rPr>
-          <w:b/>
-          <w:color w:val="000000"/>
-        </w:rPr>
-        <w:t>If the respondent is a minor</w:t>
-      </w:r>
-      <w:r>
-        <w:rPr>
-          <w:color w:val="000000"/>
-        </w:rPr>
-        <w:t xml:space="preserve">, you must also have a copy of the petition, any evidence </w:t>
-      </w:r>
-      <w:proofErr w:type="gramStart"/>
-      <w:r>
-        <w:rPr>
-          <w:color w:val="000000"/>
-        </w:rPr>
-        <w:t>attachments,  Notice</w:t>
-      </w:r>
-      <w:proofErr w:type="gramEnd"/>
-      <w:r>
-        <w:rPr>
-          <w:color w:val="000000"/>
-        </w:rPr>
-        <w:t xml:space="preserve"> of Hearing (if applicable) and order served on the respondent’s parent(s), guardian(s), or custodian(s), if you know their location.</w:t>
-      </w:r>
-    </w:p>
-    <w:p>
-      <w:pPr>
-        <w:pStyle w:val="Normalforinsertedinstructions"/>
-        <w:rPr>
-          <w:color w:val="000000"/>
-        </w:rPr>
-      </w:pPr>
-      <w:r>
-        <w:rPr>
-          <w:color w:val="000000"/>
-        </w:rPr>
-        <w:t xml:space="preserve">{%p </w:t>
-      </w:r>
-      <w:proofErr w:type="gramStart"/>
-      <w:r>
-        <w:rPr>
-          <w:color w:val="000000"/>
-        </w:rPr>
-        <w:t>endif %}</w:t>
-      </w:r>
-      <w:proofErr w:type="gramEnd"/>
-    </w:p>
-    <w:p>
-      <w:pPr>
-        <w:pStyle w:val="Heading3"/>
-      </w:pPr>
-      <w:r>
-        <w:lastRenderedPageBreak/>
-        <w:t xml:space="preserve">Step 7: </w:t>
-      </w:r>
-      <w:r>
-        <w:t xml:space="preserve">File </w:t>
-      </w:r>
-      <w:proofErr w:type="gramStart"/>
-      <w:r>
-        <w:t>the completed</w:t>
-      </w:r>
-      <w:proofErr w:type="gramEnd"/>
-      <w:r>
-        <w:t xml:space="preserve"> Proof of Service forms with the court clerk</w:t>
-      </w:r>
-    </w:p>
-    <w:p>
-      <w:pPr>
-        <w:pStyle w:val="Normalforinsertedinstructions"/>
-        <w:rPr>
-          <w:color w:val="000000"/>
-        </w:rPr>
-      </w:pPr>
-      <w:r>
-        <w:rPr>
-          <w:color w:val="000000"/>
-        </w:rPr>
-        <w:t xml:space="preserve">{%p if </w:t>
-      </w:r>
-      <w:proofErr w:type="spellStart"/>
-      <w:r>
-        <w:t>has_next_friend_</w:t>
-      </w:r>
-      <w:proofErr w:type="gramStart"/>
-      <w:r>
-        <w:t>petitioning</w:t>
-      </w:r>
-      <w:proofErr w:type="spellEnd"/>
-      <w:r>
-        <w:rPr>
-          <w:color w:val="000000"/>
-        </w:rPr>
-        <w:t xml:space="preserve"> %}</w:t>
-      </w:r>
-      <w:proofErr w:type="gramEnd"/>
-    </w:p>
-    <w:p>
-      <w:pPr>
-        <w:pStyle w:val="Normalforinsertedinstructions"/>
-        <w:rPr>
-          <w:color w:val="000000"/>
-        </w:rPr>
-      </w:pPr>
-      <w:r>
-        <w:rPr>
-          <w:color w:val="000000"/>
-        </w:rPr>
-        <w:t>Your next friend will need to complete this step for you.</w:t>
-      </w:r>
-    </w:p>
-    <w:p>
-      <w:pPr>
-        <w:pStyle w:val="Normalforinsertedinstructions"/>
-        <w:rPr>
-          <w:color w:val="000000"/>
-        </w:rPr>
-      </w:pPr>
-      <w:r>
-        <w:rPr>
-          <w:color w:val="000000"/>
-        </w:rPr>
-        <w:t xml:space="preserve">{%p </w:t>
-      </w:r>
-      <w:proofErr w:type="gramStart"/>
-      <w:r>
-        <w:rPr>
-          <w:color w:val="000000"/>
-        </w:rPr>
-        <w:t>endif %}</w:t>
-      </w:r>
-      <w:proofErr w:type="gramEnd"/>
-    </w:p>
-    <w:p>
-      <w:pPr>
-        <w:pStyle w:val="Normalforinsertedinstructions"/>
-        <w:rPr>
-          <w:color w:val="000000"/>
-        </w:rPr>
-      </w:pPr>
-      <w:r>
-        <w:rPr>
-          <w:color w:val="000000"/>
-        </w:rPr>
-        <w:t>After the Respondent is</w:t>
-      </w:r>
-      <w:r>
-        <w:t xml:space="preserve"> </w:t>
-      </w:r>
-      <w:r>
-        <w:t>served</w:t>
-      </w:r>
-      <w:r>
-        <w:t xml:space="preserve"> with </w:t>
-      </w:r>
-      <w:r>
-        <w:rPr>
-          <w:color w:val="000000"/>
-        </w:rPr>
-        <w:t xml:space="preserve">the </w:t>
-      </w:r>
-      <w:r>
-        <w:rPr>
-          <w:color w:val="000000"/>
-        </w:rPr>
-        <w:t>petition and the PPO</w:t>
-      </w:r>
-      <w:r>
-        <w:rPr>
-          <w:color w:val="000000"/>
-        </w:rPr>
-        <w:t>, the server must complete</w:t>
-      </w:r>
-      <w:r>
-        <w:rPr>
-          <w:color w:val="000000"/>
-        </w:rPr>
-        <w:t xml:space="preserve"> </w:t>
-      </w:r>
-      <w:r>
-        <w:rPr>
-          <w:color w:val="000000"/>
-        </w:rPr>
-        <w:t xml:space="preserve">the Proof of Service form. In Oakland County, there is just one Proof of Service form that you need. The PPO Office will send it to you in the same e-mail </w:t>
-      </w:r>
-      <w:r>
-        <w:rPr>
-          <w:color w:val="222222"/>
-        </w:rPr>
-        <w:t>that included the documents to be served</w:t>
-      </w:r>
-      <w:r>
-        <w:rPr>
-          <w:color w:val="000000"/>
-        </w:rPr>
-        <w:t>.</w:t>
-      </w:r>
-    </w:p>
-    <w:p>
-      <w:pPr>
-        <w:pStyle w:val="Normalforinsertedinstructions"/>
-        <w:rPr>
-          <w:color w:val="000000"/>
-        </w:rPr>
-      </w:pPr>
-      <w:r>
-        <w:rPr>
-          <w:color w:val="000000"/>
-        </w:rPr>
-        <w:t xml:space="preserve">Make sure that you file the Proof of Service with the court through </w:t>
+        <w:t xml:space="preserve"> to ask for instructions and a form. </w:t>
+      </w:r>
+      <w:r>
+        <w:t xml:space="preserve">This form must be completed and submitted through </w:t>
       </w:r>
       <w:hyperlink r:id="rId13" w:history="1">
         <w:proofErr w:type="spellStart"/>
@@ -1415,84 +1011,726 @@
         <w:proofErr w:type="spellEnd"/>
       </w:hyperlink>
       <w:r>
-        <w:rPr>
-          <w:color w:val="000000"/>
-        </w:rPr>
-        <w:t xml:space="preserve">. If the Respondent was served by mail, the green card signed by the Respondent (the return receipt) must also be filed. Instructions for filing the Proof of Service can be found in the e-mail from the PPO Office that </w:t>
-      </w:r>
-      <w:proofErr w:type="gramStart"/>
-      <w:r>
-        <w:rPr>
-          <w:color w:val="000000"/>
-        </w:rPr>
-        <w:t>included</w:t>
-      </w:r>
-      <w:proofErr w:type="gramEnd"/>
-      <w:r>
-        <w:rPr>
-          <w:color w:val="000000"/>
-        </w:rPr>
-        <w:t xml:space="preserve"> the documents to be served.</w:t>
-      </w:r>
-    </w:p>
-    <w:p>
-      <w:pPr>
-        <w:pStyle w:val="Normalforinsertedinstructions"/>
-        <w:rPr>
-          <w:color w:val="000000"/>
-        </w:rPr>
-      </w:pPr>
-      <w:r>
-        <w:rPr>
-          <w:color w:val="000000"/>
-        </w:rPr>
-        <w:t xml:space="preserve">After you have your PPO, you can enforce it by calling the police if the Respondent ever violates it. It is a good idea to </w:t>
-      </w:r>
-      <w:proofErr w:type="gramStart"/>
-      <w:r>
-        <w:rPr>
-          <w:color w:val="000000"/>
-        </w:rPr>
-        <w:t>keep a copy of your PPO and Proof of Service with you at all times</w:t>
-      </w:r>
-      <w:proofErr w:type="gramEnd"/>
-      <w:r>
-        <w:rPr>
-          <w:color w:val="000000"/>
-        </w:rPr>
-        <w:t xml:space="preserve"> because it will make enforcement easier if it becomes necessary.</w:t>
-      </w:r>
-    </w:p>
-    <w:p>
-      <w:pPr>
-        <w:pStyle w:val="Normalforinsertedinstructions"/>
-        <w:rPr>
-          <w:color w:val="000000"/>
-        </w:rPr>
-      </w:pPr>
-      <w:r>
-        <w:rPr>
-          <w:color w:val="000000"/>
-        </w:rPr>
-        <w:t xml:space="preserve">If the Respondent violates the PPO and they are not arrested, also call the PPO Office or e-mail them at </w:t>
-      </w:r>
-      <w:hyperlink r:id="rId14">
+        <w:t xml:space="preserve">. </w:t>
+      </w:r>
+      <w:r>
+        <w:t xml:space="preserve">If a hearing is granted, you will find the Notice of Hearing in </w:t>
+      </w:r>
+      <w:hyperlink r:id="rId14" w:history="1">
+        <w:proofErr w:type="spellStart"/>
         <w:r>
           <w:rPr>
             <w:color w:val="0563C1"/>
             <w:u w:val="single"/>
           </w:rPr>
-          <w:t>PPO@oakgov.com</w:t>
+          <w:t>MiFILE</w:t>
+        </w:r>
+        <w:proofErr w:type="spellEnd"/>
+      </w:hyperlink>
+      <w:r>
+        <w:t xml:space="preserve">. For questions about </w:t>
+      </w:r>
+      <w:proofErr w:type="spellStart"/>
+      <w:r>
+        <w:t>efiling</w:t>
+      </w:r>
+      <w:proofErr w:type="spellEnd"/>
+      <w:r>
+        <w:t xml:space="preserve"> in </w:t>
+      </w:r>
+      <w:hyperlink r:id="rId15" w:history="1">
+        <w:proofErr w:type="spellStart"/>
+        <w:r>
+          <w:rPr>
+            <w:color w:val="0563C1"/>
+            <w:u w:val="single"/>
+          </w:rPr>
+          <w:t>MiFILE</w:t>
+        </w:r>
+        <w:proofErr w:type="spellEnd"/>
+      </w:hyperlink>
+      <w:r>
+        <w:t>, contact the Court Clerk’s Office at 248-858-0582.</w:t>
+      </w:r>
+    </w:p>
+    <w:p>
+      <w:pPr>
+        <w:pStyle w:val="Heading3"/>
+      </w:pPr>
+      <w:r>
+        <w:t xml:space="preserve">Step 6: Have the Respondent served </w:t>
+      </w:r>
+    </w:p>
+    <w:p>
+      <w:pPr>
+        <w:pStyle w:val="Normalforinsertedinstructions"/>
+        <w:rPr>
+          <w:color w:val="000000"/>
+        </w:rPr>
+      </w:pPr>
+      <w:r>
+        <w:rPr>
+          <w:b/>
+          <w:color w:val="000000"/>
+        </w:rPr>
+        <w:t>Gather what you need for service.</w:t>
+      </w:r>
+      <w:r>
+        <w:rPr>
+          <w:color w:val="000000"/>
+        </w:rPr>
+        <w:t xml:space="preserve"> If a judge granted you a PPO, you </w:t>
+      </w:r>
+      <w:proofErr w:type="gramStart"/>
+      <w:r>
+        <w:rPr>
+          <w:color w:val="000000"/>
+        </w:rPr>
+        <w:t>will</w:t>
+      </w:r>
+      <w:proofErr w:type="gramEnd"/>
+      <w:r>
+        <w:rPr>
+          <w:color w:val="000000"/>
+        </w:rPr>
+        <w:t xml:space="preserve"> need the Personal Protection Order</w:t>
+      </w:r>
+      <w:r>
+        <w:t xml:space="preserve"> and the </w:t>
+      </w:r>
+      <w:r>
+        <w:rPr>
+          <w:color w:val="000000"/>
+        </w:rPr>
+        <w:t>Petition (with any evidence you filed). You also need the Respondent's address and any other information the process server needs to find the Respondent.</w:t>
+      </w:r>
+    </w:p>
+    <w:p>
+      <w:pPr>
+        <w:pStyle w:val="Normalforinsertedinstructions"/>
+        <w:rPr>
+          <w:color w:val="000000"/>
+        </w:rPr>
+      </w:pPr>
+      <w:r>
+        <w:rPr>
+          <w:color w:val="000000"/>
+        </w:rPr>
+        <w:t xml:space="preserve">If the judge denied your ex </w:t>
+      </w:r>
+      <w:proofErr w:type="spellStart"/>
+      <w:r>
+        <w:rPr>
+          <w:color w:val="000000"/>
+        </w:rPr>
+        <w:t>parte</w:t>
+      </w:r>
+      <w:proofErr w:type="spellEnd"/>
+      <w:r>
+        <w:rPr>
+          <w:color w:val="000000"/>
+        </w:rPr>
+        <w:t xml:space="preserve"> PPO petition but set a hearing, you will need the PPO Petition (with any evidence you filed), Notice of Hearing,</w:t>
+      </w:r>
+      <w:r>
+        <w:rPr>
+          <w:color w:val="000000"/>
+        </w:rPr>
+        <w:t xml:space="preserve"> </w:t>
+      </w:r>
+      <w:r>
+        <w:rPr>
+          <w:color w:val="000000"/>
+        </w:rPr>
+        <w:t xml:space="preserve">Denial Order, </w:t>
+      </w:r>
+      <w:r>
+        <w:rPr>
+          <w:color w:val="000000"/>
+        </w:rPr>
+        <w:t xml:space="preserve">and Zoom instructions (if the </w:t>
+      </w:r>
+      <w:r>
+        <w:rPr>
+          <w:color w:val="000000"/>
+        </w:rPr>
+        <w:t>judge</w:t>
+      </w:r>
+      <w:r>
+        <w:rPr>
+          <w:color w:val="000000"/>
+        </w:rPr>
+        <w:t>’</w:t>
+      </w:r>
+      <w:r>
+        <w:rPr>
+          <w:color w:val="000000"/>
+        </w:rPr>
+        <w:t>s clerk</w:t>
+      </w:r>
+      <w:r>
+        <w:rPr>
+          <w:color w:val="000000"/>
+        </w:rPr>
+        <w:t xml:space="preserve"> </w:t>
+      </w:r>
+      <w:r>
+        <w:rPr>
+          <w:color w:val="000000"/>
+        </w:rPr>
+        <w:t>sent you Zoom instructions). You also need the Respondent's address and any other information the process server needs to find the Respondent.</w:t>
+      </w:r>
+    </w:p>
+    <w:p>
+      <w:pPr>
+        <w:pStyle w:val="Normalforinsertedinstructions"/>
+        <w:rPr>
+          <w:b/>
+          <w:color w:val="000000"/>
+        </w:rPr>
+      </w:pPr>
+      <w:r>
+        <w:rPr>
+          <w:b/>
+          <w:color w:val="000000"/>
+        </w:rPr>
+        <w:t>Have the papers served (sent or given to) the Respondent.</w:t>
+      </w:r>
+      <w:r>
+        <w:rPr>
+          <w:color w:val="000000"/>
+        </w:rPr>
+        <w:t xml:space="preserve"> This can be done by a police officer, professional process server, or someone else who is 18 years or older. </w:t>
+      </w:r>
+      <w:r>
+        <w:rPr>
+          <w:color w:val="000000"/>
+        </w:rPr>
+        <w:t xml:space="preserve">The Sheriff's Office Civil Unit is one option </w:t>
+      </w:r>
+      <w:proofErr w:type="gramStart"/>
+      <w:r>
+        <w:rPr>
+          <w:color w:val="000000"/>
+        </w:rPr>
+        <w:t>of</w:t>
+      </w:r>
+      <w:proofErr w:type="gramEnd"/>
+      <w:r>
+        <w:rPr>
+          <w:color w:val="000000"/>
+        </w:rPr>
+        <w:t xml:space="preserve"> someone who can serve documents for you. You can find their contact information in the Procedural Instructions for PPO document. </w:t>
+      </w:r>
+      <w:r>
+        <w:t xml:space="preserve">{% if </w:t>
+      </w:r>
+      <w:proofErr w:type="spellStart"/>
+      <w:r>
+        <w:t>has_next_friend_petitioning</w:t>
+      </w:r>
+      <w:proofErr w:type="spellEnd"/>
+      <w:r>
+        <w:t xml:space="preserve"> %}</w:t>
+      </w:r>
+      <w:r>
+        <w:rPr>
+          <w:b/>
+          <w:bCs/>
+          <w:color w:val="000000"/>
+        </w:rPr>
+        <w:t xml:space="preserve">Neither you nor your </w:t>
+      </w:r>
+      <w:r>
+        <w:rPr>
+          <w:b/>
+          <w:bCs/>
+          <w:color w:val="000000"/>
+        </w:rPr>
+        <w:lastRenderedPageBreak/>
+        <w:t>next friend is allowed to serve the Respondent.</w:t>
+      </w:r>
+      <w:r>
+        <w:t>{%</w:t>
+      </w:r>
+      <w:r>
+        <w:t xml:space="preserve"> else</w:t>
+      </w:r>
+      <w:r>
+        <w:t xml:space="preserve"> </w:t>
+      </w:r>
+      <w:proofErr w:type="gramStart"/>
+      <w:r>
+        <w:t>%}</w:t>
+      </w:r>
+      <w:r>
+        <w:rPr>
+          <w:b/>
+          <w:color w:val="000000"/>
+        </w:rPr>
+        <w:t>Do</w:t>
+      </w:r>
+      <w:proofErr w:type="gramEnd"/>
+      <w:r>
+        <w:rPr>
+          <w:b/>
+          <w:color w:val="000000"/>
+        </w:rPr>
+        <w:t xml:space="preserve"> not serve the Respondent </w:t>
+      </w:r>
+      <w:proofErr w:type="gramStart"/>
+      <w:r>
+        <w:rPr>
+          <w:b/>
+          <w:color w:val="000000"/>
+        </w:rPr>
+        <w:t>yourself.</w:t>
+      </w:r>
+      <w:r>
+        <w:t>{</w:t>
+      </w:r>
+      <w:proofErr w:type="gramEnd"/>
+      <w:r>
+        <w:t xml:space="preserve">% </w:t>
+      </w:r>
+      <w:proofErr w:type="gramStart"/>
+      <w:r>
+        <w:t>endif %}</w:t>
+      </w:r>
+      <w:proofErr w:type="gramEnd"/>
+    </w:p>
+    <w:p>
+      <w:pPr>
+        <w:pStyle w:val="Normalforinsertedinstructions"/>
+        <w:rPr>
+          <w:color w:val="000000"/>
+        </w:rPr>
+      </w:pPr>
+      <w:r>
+        <w:rPr>
+          <w:color w:val="000000"/>
+        </w:rPr>
+        <w:t xml:space="preserve">The papers can also be served by registered mail with return receipt requested and delivery restricted to the Respondent. Even if the Respondent is served by mail, you need to find someone else to do the mailing. </w:t>
+      </w:r>
+      <w:r>
+        <w:rPr>
+          <w:color w:val="202124"/>
+        </w:rPr>
+        <w:t>The server’s address—not yours—should be the one on the return receipt.</w:t>
+      </w:r>
+      <w:r>
+        <w:rPr>
+          <w:color w:val="000000"/>
+        </w:rPr>
+        <w:t xml:space="preserve"> To learn more, read </w:t>
+      </w:r>
+      <w:hyperlink r:id="rId16">
+        <w:r>
+          <w:rPr>
+            <w:color w:val="0563C1"/>
+            <w:u w:val="single"/>
+          </w:rPr>
+          <w:t>Serving Your Personal Protection Order</w:t>
         </w:r>
       </w:hyperlink>
       <w:r>
         <w:rPr>
           <w:color w:val="000000"/>
         </w:rPr>
-        <w:t xml:space="preserve"> for instructions on how to report the violation to the court. Even if you filed a police report, the police </w:t>
-      </w:r>
+        <w:t xml:space="preserve">. </w:t>
+      </w:r>
+    </w:p>
+    <w:p>
+      <w:pPr>
+        <w:pStyle w:val="Normalforinsertedinstructions"/>
+        <w:rPr>
+          <w:color w:val="000000"/>
+        </w:rPr>
+      </w:pPr>
       <w:proofErr w:type="gramStart"/>
       <w:r>
+        <w:t>{%p if</w:t>
+      </w:r>
+      <w:proofErr w:type="gramEnd"/>
+      <w:r>
+        <w:t xml:space="preserve"> </w:t>
+      </w:r>
+      <w:proofErr w:type="spellStart"/>
+      <w:r>
+        <w:t>respondent_is_minor</w:t>
+      </w:r>
+      <w:proofErr w:type="spellEnd"/>
+      <w:r>
+        <w:t xml:space="preserve"> and not </w:t>
+      </w:r>
+      <w:proofErr w:type="spellStart"/>
+      <w:r>
+        <w:t>respondent_is_emancipated_</w:t>
+      </w:r>
+      <w:proofErr w:type="gramStart"/>
+      <w:r>
+        <w:t>minor</w:t>
+      </w:r>
+      <w:proofErr w:type="spellEnd"/>
+      <w:r>
+        <w:t xml:space="preserve"> %}</w:t>
+      </w:r>
+      <w:proofErr w:type="gramEnd"/>
+    </w:p>
+    <w:p>
+      <w:pPr>
+        <w:pStyle w:val="Normalforinsertedinstructions"/>
+        <w:rPr>
+          <w:color w:val="000000"/>
+        </w:rPr>
+      </w:pPr>
+      <w:r>
+        <w:rPr>
+          <w:b/>
+          <w:color w:val="000000"/>
+        </w:rPr>
+        <w:t>If the respondent is a minor</w:t>
+      </w:r>
+      <w:r>
+        <w:rPr>
+          <w:color w:val="000000"/>
+        </w:rPr>
+        <w:t xml:space="preserve">, you must also have a copy of the petition, any evidence </w:t>
+      </w:r>
+      <w:proofErr w:type="gramStart"/>
+      <w:r>
+        <w:rPr>
+          <w:color w:val="000000"/>
+        </w:rPr>
+        <w:t>attachments,  Notice</w:t>
+      </w:r>
+      <w:proofErr w:type="gramEnd"/>
+      <w:r>
+        <w:rPr>
+          <w:color w:val="000000"/>
+        </w:rPr>
+        <w:t xml:space="preserve"> of Hearing (if applicable) and order served on the respondent’s parent(s), guardian(s), or custodian(s), if you know their location.</w:t>
+      </w:r>
+    </w:p>
+    <w:p>
+      <w:pPr>
+        <w:pStyle w:val="Normalforinsertedinstructions"/>
+        <w:rPr>
+          <w:color w:val="000000"/>
+        </w:rPr>
+      </w:pPr>
+      <w:r>
+        <w:rPr>
+          <w:color w:val="000000"/>
+        </w:rPr>
+        <w:t xml:space="preserve">{%p </w:t>
+      </w:r>
+      <w:proofErr w:type="gramStart"/>
+      <w:r>
+        <w:rPr>
+          <w:color w:val="000000"/>
+        </w:rPr>
+        <w:t>endif %}</w:t>
+      </w:r>
+      <w:proofErr w:type="gramEnd"/>
+    </w:p>
+    <w:p>
+      <w:pPr>
+        <w:pStyle w:val="Heading3"/>
+      </w:pPr>
+      <w:r>
+        <w:t xml:space="preserve">Step 7: </w:t>
+      </w:r>
+      <w:r>
+        <w:t xml:space="preserve">File </w:t>
+      </w:r>
+      <w:proofErr w:type="gramStart"/>
+      <w:r>
+        <w:t>the completed</w:t>
+      </w:r>
+      <w:proofErr w:type="gramEnd"/>
+      <w:r>
+        <w:t xml:space="preserve"> Proof of Service forms with the court clerk</w:t>
+      </w:r>
+    </w:p>
+    <w:p>
+      <w:pPr>
+        <w:pStyle w:val="Normalforinsertedinstructions"/>
+        <w:rPr>
+          <w:color w:val="000000"/>
+        </w:rPr>
+      </w:pPr>
+      <w:r>
+        <w:rPr>
+          <w:color w:val="000000"/>
+        </w:rPr>
+        <w:t xml:space="preserve">{%p if </w:t>
+      </w:r>
+      <w:proofErr w:type="spellStart"/>
+      <w:r>
+        <w:t>has_next_friend_</w:t>
+      </w:r>
+      <w:proofErr w:type="gramStart"/>
+      <w:r>
+        <w:t>petitioning</w:t>
+      </w:r>
+      <w:proofErr w:type="spellEnd"/>
+      <w:r>
+        <w:rPr>
+          <w:color w:val="000000"/>
+        </w:rPr>
+        <w:t xml:space="preserve"> %}</w:t>
+      </w:r>
+      <w:proofErr w:type="gramEnd"/>
+    </w:p>
+    <w:p>
+      <w:pPr>
+        <w:pStyle w:val="Normalforinsertedinstructions"/>
+        <w:rPr>
+          <w:color w:val="000000"/>
+        </w:rPr>
+      </w:pPr>
+      <w:r>
+        <w:rPr>
+          <w:color w:val="000000"/>
+        </w:rPr>
+        <w:t>Your next friend will need to complete this step for you.</w:t>
+      </w:r>
+    </w:p>
+    <w:p>
+      <w:pPr>
+        <w:pStyle w:val="Normalforinsertedinstructions"/>
+        <w:rPr>
+          <w:color w:val="000000"/>
+        </w:rPr>
+      </w:pPr>
+      <w:r>
+        <w:rPr>
+          <w:color w:val="000000"/>
+        </w:rPr>
+        <w:t xml:space="preserve">{%p </w:t>
+      </w:r>
+      <w:proofErr w:type="gramStart"/>
+      <w:r>
+        <w:rPr>
+          <w:color w:val="000000"/>
+        </w:rPr>
+        <w:t>endif %}</w:t>
+      </w:r>
+      <w:proofErr w:type="gramEnd"/>
+    </w:p>
+    <w:p>
+      <w:pPr>
+        <w:pStyle w:val="Normalforinsertedinstructions"/>
+        <w:rPr>
+          <w:color w:val="000000"/>
+        </w:rPr>
+      </w:pPr>
+      <w:r>
+        <w:rPr>
+          <w:color w:val="000000"/>
+        </w:rPr>
+        <w:t>If the judge signs the PPO:</w:t>
+      </w:r>
+    </w:p>
+    <w:p>
+      <w:pPr>
+        <w:pStyle w:val="Normalforinsertedinstructions"/>
+        <w:rPr>
+          <w:color w:val="000000"/>
+        </w:rPr>
+      </w:pPr>
+      <w:r>
+        <w:rPr>
+          <w:color w:val="000000"/>
+        </w:rPr>
+        <w:t>After the Respondent is</w:t>
+      </w:r>
+      <w:r>
+        <w:t xml:space="preserve"> </w:t>
+      </w:r>
+      <w:r>
+        <w:t>served</w:t>
+      </w:r>
+      <w:r>
+        <w:t xml:space="preserve"> with </w:t>
+      </w:r>
+      <w:r>
+        <w:rPr>
+          <w:color w:val="000000"/>
+        </w:rPr>
+        <w:t xml:space="preserve">the </w:t>
+      </w:r>
+      <w:r>
+        <w:rPr>
+          <w:color w:val="000000"/>
+        </w:rPr>
+        <w:t>petition and the PPO</w:t>
+      </w:r>
+      <w:r>
+        <w:rPr>
+          <w:color w:val="000000"/>
+        </w:rPr>
+        <w:t>, the server must complete</w:t>
+      </w:r>
+      <w:r>
+        <w:rPr>
+          <w:color w:val="000000"/>
+        </w:rPr>
+        <w:t xml:space="preserve"> </w:t>
+      </w:r>
+      <w:r>
+        <w:rPr>
+          <w:color w:val="000000"/>
+        </w:rPr>
+        <w:t xml:space="preserve">the Proof of Service form. In Oakland County, there is just one Proof of Service form that you need. The PPO Office will send it to you in the same e-mail </w:t>
+      </w:r>
+      <w:r>
+        <w:rPr>
+          <w:color w:val="222222"/>
+        </w:rPr>
+        <w:t xml:space="preserve">that </w:t>
+      </w:r>
+      <w:r>
+        <w:rPr>
+          <w:color w:val="222222"/>
+        </w:rPr>
+        <w:t>confirmed your PPO filing was submitted to the court</w:t>
+      </w:r>
+      <w:r>
+        <w:rPr>
+          <w:color w:val="000000"/>
+        </w:rPr>
+        <w:t>.</w:t>
+      </w:r>
+    </w:p>
+    <w:p>
+      <w:pPr>
+        <w:pStyle w:val="Normalforinsertedinstructions"/>
+        <w:rPr>
+          <w:color w:val="000000"/>
+        </w:rPr>
+      </w:pPr>
+      <w:r>
+        <w:rPr>
+          <w:color w:val="000000"/>
+        </w:rPr>
+        <w:t xml:space="preserve">Make sure that you file the Proof of Service with the court through </w:t>
+      </w:r>
+      <w:hyperlink r:id="rId17" w:history="1">
+        <w:proofErr w:type="spellStart"/>
+        <w:r>
+          <w:rPr>
+            <w:color w:val="0563C1"/>
+            <w:u w:val="single"/>
+          </w:rPr>
+          <w:t>MiFILE</w:t>
+        </w:r>
+        <w:proofErr w:type="spellEnd"/>
+      </w:hyperlink>
+      <w:r>
+        <w:rPr>
+          <w:color w:val="000000"/>
+        </w:rPr>
+        <w:t xml:space="preserve">. If the Respondent was served by mail, the green card signed by the Respondent (the return receipt) must also be filed. Instructions for filing the Proof of Service can be found in the </w:t>
+      </w:r>
+      <w:r>
+        <w:rPr>
+          <w:color w:val="000000"/>
+        </w:rPr>
+        <w:t>Procedural Instructions for PPO document in the confirmation e-mail from the PPO Office</w:t>
+      </w:r>
+      <w:r>
+        <w:rPr>
+          <w:color w:val="000000"/>
+        </w:rPr>
+        <w:t>.</w:t>
+      </w:r>
+    </w:p>
+    <w:p>
+      <w:pPr>
+        <w:pStyle w:val="Normalforinsertedinstructions"/>
+        <w:rPr>
+          <w:color w:val="000000"/>
+        </w:rPr>
+      </w:pPr>
+      <w:r>
+        <w:rPr>
+          <w:color w:val="000000"/>
+        </w:rPr>
+        <w:t xml:space="preserve">After you have your PPO, you can enforce it by calling the police if the Respondent ever violates it. It is a good idea to </w:t>
+      </w:r>
+      <w:proofErr w:type="gramStart"/>
+      <w:r>
+        <w:rPr>
+          <w:color w:val="000000"/>
+        </w:rPr>
+        <w:t>keep a copy of your PPO and Proof of Service with you at all times</w:t>
+      </w:r>
+      <w:proofErr w:type="gramEnd"/>
+      <w:r>
+        <w:rPr>
+          <w:color w:val="000000"/>
+        </w:rPr>
+        <w:t xml:space="preserve"> because it will make enforcement easier if it becomes necessary.</w:t>
+      </w:r>
+    </w:p>
+    <w:p>
+      <w:pPr>
+        <w:pStyle w:val="Normalforinsertedinstructions"/>
+        <w:rPr>
+          <w:color w:val="000000"/>
+        </w:rPr>
+      </w:pPr>
+      <w:r>
+        <w:rPr>
+          <w:color w:val="000000"/>
+        </w:rPr>
+        <w:t xml:space="preserve">If the Respondent violates the PPO and they are not arrested, </w:t>
+      </w:r>
+      <w:r>
+        <w:rPr>
+          <w:color w:val="000000"/>
+        </w:rPr>
+        <w:t xml:space="preserve">e-mail the PPO Office at </w:t>
+      </w:r>
+      <w:hyperlink r:id="rId18" w:history="1">
+        <w:r>
+          <w:rPr>
+            <w:color w:val="0563C1"/>
+            <w:u w:val="single"/>
+          </w:rPr>
+          <w:t>ppo@oaklandcoun</w:t>
+        </w:r>
+        <w:r>
+          <w:rPr>
+            <w:color w:val="0563C1"/>
+            <w:u w:val="single"/>
+          </w:rPr>
+          <w:t>t</w:t>
+        </w:r>
+        <w:r>
+          <w:rPr>
+            <w:color w:val="0563C1"/>
+            <w:u w:val="single"/>
+          </w:rPr>
+          <w:t>ymi.gov</w:t>
+        </w:r>
+      </w:hyperlink>
+      <w:r>
+        <w:rPr>
+          <w:color w:val="000000"/>
+        </w:rPr>
+        <w:t xml:space="preserve"> </w:t>
+      </w:r>
+      <w:r>
+        <w:rPr>
+          <w:color w:val="000000"/>
+        </w:rPr>
+        <w:t xml:space="preserve">for instructions on how to report the violation to the court. Even if you filed a police report, the police </w:t>
+      </w:r>
+      <w:proofErr w:type="gramStart"/>
+      <w:r>
         <w:rPr>
           <w:color w:val="000000"/>
         </w:rPr>
@@ -1503,7 +1741,78 @@
         <w:rPr>
           <w:color w:val="000000"/>
         </w:rPr>
-        <w:t xml:space="preserve"> not report the violation to the court. If you want the court to know about the violation, you must report the violation to the court.</w:t>
+        <w:t xml:space="preserve"> not report the violation to the court. If you want the court to know about the violation, you must </w:t>
+      </w:r>
+      <w:r>
+        <w:rPr>
+          <w:color w:val="000000"/>
+        </w:rPr>
+        <w:t xml:space="preserve">file a motion to </w:t>
+      </w:r>
+      <w:r>
+        <w:rPr>
+          <w:color w:val="000000"/>
+        </w:rPr>
+        <w:t>report the violation to the court.</w:t>
+      </w:r>
+    </w:p>
+    <w:p>
+      <w:pPr>
+        <w:pStyle w:val="Normalforinsertedinstructions"/>
+        <w:rPr>
+          <w:color w:val="000000"/>
+        </w:rPr>
+      </w:pPr>
+      <w:r>
+        <w:rPr>
+          <w:color w:val="000000"/>
+        </w:rPr>
+        <w:t>If the ex-</w:t>
+      </w:r>
+      <w:proofErr w:type="spellStart"/>
+      <w:r>
+        <w:rPr>
+          <w:color w:val="000000"/>
+        </w:rPr>
+        <w:t>parte</w:t>
+      </w:r>
+      <w:proofErr w:type="spellEnd"/>
+      <w:r>
+        <w:rPr>
+          <w:color w:val="000000"/>
+        </w:rPr>
+        <w:t xml:space="preserve"> PPO was denied and the judge set the matter for a hearing:</w:t>
+      </w:r>
+    </w:p>
+    <w:p>
+      <w:pPr>
+        <w:pStyle w:val="Normalforinsertedinstructions"/>
+        <w:rPr>
+          <w:color w:val="000000"/>
+        </w:rPr>
+      </w:pPr>
+      <w:r>
+        <w:rPr>
+          <w:color w:val="000000"/>
+        </w:rPr>
+        <w:t xml:space="preserve">After the Respondent is served with the petition, denial order, notice of hearing, and Zoom instructions (if applicable), the server must complete the Proof of Service form. In Oakland County, there is just one Proof of Service form that you need. The PPO Office will send it to you in the same e-mail that confirmed that your PPO filing was submitted to the court. Make sure that you file the Proof of Service with the court at least one business day before the hearing through </w:t>
+      </w:r>
+      <w:hyperlink r:id="rId19" w:history="1">
+        <w:proofErr w:type="spellStart"/>
+        <w:r>
+          <w:rPr>
+            <w:color w:val="0563C1"/>
+            <w:u w:val="single"/>
+          </w:rPr>
+          <w:t>MiFILE</w:t>
+        </w:r>
+        <w:proofErr w:type="spellEnd"/>
+      </w:hyperlink>
+      <w:r>
+        <w:rPr>
+          <w:color w:val="000000"/>
+        </w:rPr>
+        <w:t>. If the Respondent was served by mail, the green card signed by the Respondent (the return receipt) must also be filed. Instructions for filing the Proof of Service can be found in the Procedural Instructions for PPO document in the confirmation e-mail from the PPO Office.</w:t>
       </w:r>
     </w:p>
     <w:sectPr>
@@ -2658,7 +2967,6 @@
   <w:style w:type="character" w:default="1" w:styleId="DefaultParagraphFont">
     <w:name w:val="Default Paragraph Font"/>
     <w:uiPriority w:val="1"/>
-    <w:semiHidden/>
     <w:unhideWhenUsed/>
   </w:style>
   <w:style w:type="table" w:default="1" w:styleId="TableNormal">
@@ -2812,6 +3120,18 @@
     <w:rPr>
       <w:color w:val="605E5C"/>
       <w:shd w:val="clear" w:color="auto" w:fill="E1DFDD"/>
+    </w:rPr>
+  </w:style>
+  <w:style w:type="character" w:styleId="FollowedHyperlink">
+    <w:name w:val="FollowedHyperlink"/>
+    <w:basedOn w:val="DefaultParagraphFont"/>
+    <w:uiPriority w:val="99"/>
+    <w:semiHidden/>
+    <w:unhideWhenUsed/>
+    <w:rsid w:val="009B3EC1"/>
+    <w:rPr>
+      <w:color w:val="800080" w:themeColor="followedHyperlink"/>
+      <w:u w:val="single"/>
     </w:rPr>
   </w:style>
 </w:styles>

</xml_diff>